<commit_message>
Esperia v6 contract package, legal updates, and content additions.
- Esperia/Galascope: full v6 CLIENT-PACKAGE (EPC v6, LTSA, OEM DWU, APG specimens, Technical Agreements, EMS Addendum, Linyang warranty)
- Updated Galascope EMS-Subscription and LTSA contracts (working copies)
- legal/: Moiostrov commission agreement
- lib/portfolio-data.ts: EMS/SCADA vendor entity naming (R&D Innovations / Voltus JV); advance payment trigger updated to EPC Effective Date + APG conditions
- lib/chat-knowledge-base.ts: knowledge base updates
- docs/internal/: grid-forming PCS reference Jun 2026
- docs/teasers/ + public/: RelyEZ 3.2 Cyprus teaser
- app/blog/: grid-forming vs grid-following BESS article
- scripts/: RelyEZ teaser generator

Co-authored-by: Cursor <cursoragent@cursor.com>
</commit_message>
<xml_diff>
--- a/docs/clients/group-order/Group2_Esperia_Energy/contracts/EMS-Subscription-Galascope-may2026.docx
+++ b/docs/clients/group-order/Group2_Esperia_Energy/contracts/EMS-Subscription-Galascope-may2026.docx
@@ -154,7 +154,7 @@
           </w:tcPr>
           <w:p>
             <w:r>
-              <w:t>Lighthief EU BESS Ltd (trading as DISPERON)</w:t>
+              <w:t>R&amp;D Innovations Sp. z o.o. (trading as DISPERON), under Lighthief International Ltd</w:t>
             </w:r>
           </w:p>
         </w:tc>
@@ -188,18 +188,31 @@
           <w:p>
             <w:r>
               <w:t>Service Provider:</w:t>
-              <w:br/>
-              <w:t>Lighthief EU BESS Ltd</w:t>
-              <w:br/>
+            </w:r>
+          </w:p>
+          <w:p>
+            <w:r>
+              <w:t>R&amp;D Innovations Sp. z o.o.</w:t>
+            </w:r>
+          </w:p>
+          <w:p>
+            <w:r>
               <w:t>(trading as DISPERON)</w:t>
-              <w:br/>
-              <w:t>Reg. No. HE 474192</w:t>
-              <w:br/>
-              <w:t>28 Oktovriou &amp; Aemiliou Chourmouziou</w:t>
-              <w:br/>
-              <w:t>Lophitis Business Center I, Floor 2</w:t>
-              <w:br/>
-              <w:t>3035 Limassol, Cyprus</w:t>
+            </w:r>
+          </w:p>
+          <w:p>
+            <w:r>
+              <w:t>NIP 9492265995 · KRS [●]</w:t>
+            </w:r>
+          </w:p>
+          <w:p>
+            <w:r>
+              <w:t>Registered office: [●], Poland</w:t>
+            </w:r>
+          </w:p>
+          <w:p>
+            <w:r>
+              <w:t>a company under Lighthief International Ltd</w:t>
             </w:r>
           </w:p>
         </w:tc>
@@ -566,7 +579,7 @@
         <w:spacing w:after="80"/>
       </w:pPr>
       <w:r>
-        <w:t>The subscription fee of EUR 12,000.00 per year (ex VAT) is invoiced annually in advance from PAC date (31 January 2027, target). Payment due within 30 days of invoice. Fee is exclusive of VAT (19%). Fixed Years 1-3, thereafter annual CPI adjustment (Cyprus HICP, max 3%).</w:t>
+        <w:t>The subscription fee of EUR 12,000.00 per year (ex VAT) is invoiced annually in advance from the PAC date (set per the EPC Delivery Schedule confirmed at Connection Terms). Payment due within 30 days of invoice. Fee is exclusive of VAT (19%). Fixed Years 1-3, thereafter annual CPI adjustment (Cyprus HICP, max 3%).</w:t>
       </w:r>
     </w:p>
     <w:p>
@@ -647,7 +660,7 @@
           </w:tcPr>
           <w:p>
             <w:r>
-              <w:t>For Lighthief EU BESS Ltd (DISPERON)</w:t>
+              <w:t>For R&amp;D Innovations Sp. z o.o. (DISPERON)</w:t>
             </w:r>
           </w:p>
         </w:tc>
@@ -691,7 +704,7 @@
           </w:tcPr>
           <w:p>
             <w:r>
-              <w:t>Title: Cyprus Managing Director</w:t>
+              <w:t>Title: Director</w:t>
             </w:r>
           </w:p>
         </w:tc>

</xml_diff>